<commit_message>
feat: enhance PIN pairing functionality and update testing documentation
- Updated backend tests from 63 to 191, including new tests for PIN pairing and restore flow.
- Increased frontend unit tests from 11 to 27, covering restore UI and pairing panel.
- Added detailed instructions for rebuilding the Linux sidecar from source, including common pitfalls.
- Introduced a new PairingPanel component for manual PIN pairing when automatic pairing fails.
- Implemented tests for the PairingPanel component to ensure correct functionality.
- Updated Next.js to version 16.4.2 and added an experimental agent upgrade for security.
- Enhanced the PASADA Software Manual with instructions for connecting by PIN when automatic pairing fails.
</commit_message>
<xml_diff>
--- a/manual_assets/PASADA_Software_Manual_Guide.docx
+++ b/manual_assets/PASADA_Software_Manual_Guide.docx
@@ -11063,6 +11063,192 @@
           <w:color w:val="1F3A5F"/>
           <w:sz w:val="26"/>
         </w:rPr>
+        <w:t>Connect by PIN when automatic pairing fails</w:t>
+      </w:r>
+    </w:p>
+    <w:p>
+      <w:pPr>
+        <w:spacing w:after="120" w:before="0"/>
+      </w:pPr>
+      <w:r>
+        <w:rPr>
+          <w:rFonts w:ascii="Arial" w:hAnsi="Arial" w:cs="Arial" w:eastAsia="Arial"/>
+          <w:b w:val="0"/>
+          <w:i w:val="0"/>
+          <w:color w:val="000000"/>
+          <w:sz w:val="21"/>
+        </w:rPr>
+        <w:t>If the two computers will not connect on their own — a stubborn firewall, an access point that blocks computer-to-computer traffic, a machine whose security library failed to load — the Admin can join them by hand with a six-digit PIN. The secret still crosses the network encrypted, and the PIN itself never travels.</w:t>
+      </w:r>
+    </w:p>
+    <w:p>
+      <w:pPr>
+        <w:spacing w:after="80"/>
+        <w:ind w:left="340"/>
+      </w:pPr>
+      <w:r>
+        <w:rPr>
+          <w:rFonts w:ascii="Arial" w:hAnsi="Arial" w:cs="Arial" w:eastAsia="Arial"/>
+          <w:b/>
+          <w:color w:val="1F3A5F"/>
+          <w:sz w:val="21"/>
+        </w:rPr>
+        <w:t xml:space="preserve">1.  </w:t>
+      </w:r>
+      <w:r>
+        <w:rPr>
+          <w:rFonts w:ascii="Arial" w:hAnsi="Arial" w:cs="Arial" w:eastAsia="Arial"/>
+          <w:color w:val="000000"/>
+          <w:sz w:val="21"/>
+        </w:rPr>
+        <w:t>Admin, on PC 1 (the computer holding the registry): open Settings &gt; Computer Settings &gt; the Sharing between computers card.</w:t>
+      </w:r>
+    </w:p>
+    <w:p>
+      <w:pPr>
+        <w:spacing w:after="80"/>
+        <w:ind w:left="340"/>
+      </w:pPr>
+      <w:r>
+        <w:rPr>
+          <w:rFonts w:ascii="Arial" w:hAnsi="Arial" w:cs="Arial" w:eastAsia="Arial"/>
+          <w:b/>
+          <w:color w:val="1F3A5F"/>
+          <w:sz w:val="21"/>
+        </w:rPr>
+        <w:t xml:space="preserve">2.  </w:t>
+      </w:r>
+      <w:r>
+        <w:rPr>
+          <w:rFonts w:ascii="Arial" w:hAnsi="Arial" w:cs="Arial" w:eastAsia="Arial"/>
+          <w:color w:val="000000"/>
+          <w:sz w:val="21"/>
+        </w:rPr>
+        <w:t>Under Pair a computer, press Generate PIN. A six-digit number and a 10-minute countdown appear.</w:t>
+      </w:r>
+    </w:p>
+    <w:p>
+      <w:pPr>
+        <w:spacing w:after="80"/>
+        <w:ind w:left="340"/>
+      </w:pPr>
+      <w:r>
+        <w:rPr>
+          <w:rFonts w:ascii="Arial" w:hAnsi="Arial" w:cs="Arial" w:eastAsia="Arial"/>
+          <w:b/>
+          <w:color w:val="1F3A5F"/>
+          <w:sz w:val="21"/>
+        </w:rPr>
+        <w:t xml:space="preserve">3.  </w:t>
+      </w:r>
+      <w:r>
+        <w:rPr>
+          <w:rFonts w:ascii="Arial" w:hAnsi="Arial" w:cs="Arial" w:eastAsia="Arial"/>
+          <w:color w:val="000000"/>
+          <w:sz w:val="21"/>
+        </w:rPr>
+        <w:t>On PC 2, on the same card, type that PIN in the Join by PIN box and press Join.</w:t>
+      </w:r>
+    </w:p>
+    <w:p>
+      <w:pPr>
+        <w:spacing w:after="80"/>
+        <w:ind w:left="340"/>
+      </w:pPr>
+      <w:r>
+        <w:rPr>
+          <w:rFonts w:ascii="Arial" w:hAnsi="Arial" w:cs="Arial" w:eastAsia="Arial"/>
+          <w:b/>
+          <w:color w:val="1F3A5F"/>
+          <w:sz w:val="21"/>
+        </w:rPr>
+        <w:t xml:space="preserve">4.  </w:t>
+      </w:r>
+      <w:r>
+        <w:rPr>
+          <w:rFonts w:ascii="Arial" w:hAnsi="Arial" w:cs="Arial" w:eastAsia="Arial"/>
+          <w:color w:val="000000"/>
+          <w:sz w:val="21"/>
+        </w:rPr>
+        <w:t>When the join succeeds, both cards show the same short key fingerprint. Compare them: identical fingerprints mean both computers now share the registry.</w:t>
+      </w:r>
+    </w:p>
+    <w:p>
+      <w:pPr>
+        <w:spacing w:after="80"/>
+        <w:ind w:left="340"/>
+      </w:pPr>
+      <w:r>
+        <w:rPr>
+          <w:rFonts w:ascii="Arial" w:hAnsi="Arial" w:cs="Arial" w:eastAsia="Arial"/>
+          <w:b/>
+          <w:color w:val="1F3A5F"/>
+          <w:sz w:val="21"/>
+        </w:rPr>
+        <w:t xml:space="preserve">5.  </w:t>
+      </w:r>
+      <w:r>
+        <w:rPr>
+          <w:rFonts w:ascii="Arial" w:hAnsi="Arial" w:cs="Arial" w:eastAsia="Arial"/>
+          <w:color w:val="000000"/>
+          <w:sz w:val="21"/>
+        </w:rPr>
+        <w:t>PC 2 then pulls the records from PC 1 within seconds.</w:t>
+      </w:r>
+    </w:p>
+    <w:p>
+      <w:pPr>
+        <w:pStyle w:val="ListBullet"/>
+        <w:spacing w:after="60"/>
+      </w:pPr>
+      <w:r>
+        <w:rPr>
+          <w:rFonts w:ascii="Arial" w:hAnsi="Arial" w:cs="Arial" w:eastAsia="Arial"/>
+          <w:color w:val="000000"/>
+          <w:sz w:val="21"/>
+        </w:rPr>
+        <w:t>The PIN works for 10 minutes only, and the host computer accepts it only while its own screen shows it armed.</w:t>
+      </w:r>
+    </w:p>
+    <w:p>
+      <w:pPr>
+        <w:pStyle w:val="ListBullet"/>
+        <w:spacing w:after="60"/>
+      </w:pPr>
+      <w:r>
+        <w:rPr>
+          <w:rFonts w:ascii="Arial" w:hAnsi="Arial" w:cs="Arial" w:eastAsia="Arial"/>
+          <w:color w:val="000000"/>
+          <w:sz w:val="21"/>
+        </w:rPr>
+        <w:t>Repeated wrong guesses are refused and recorded, and the joining computer is locked out until the Admin re-arms a fresh PIN.</w:t>
+      </w:r>
+    </w:p>
+    <w:p>
+      <w:pPr>
+        <w:pStyle w:val="ListBullet"/>
+        <w:spacing w:after="60"/>
+      </w:pPr>
+      <w:r>
+        <w:rPr>
+          <w:rFonts w:ascii="Arial" w:hAnsi="Arial" w:cs="Arial" w:eastAsia="Arial"/>
+          <w:color w:val="000000"/>
+          <w:sz w:val="21"/>
+        </w:rPr>
+        <w:t>The automatic connection stays ON: the PIN path is only a manual rescue for the times when the automatic one cannot run.</w:t>
+      </w:r>
+    </w:p>
+    <w:p>
+      <w:pPr>
+        <w:spacing w:after="80" w:before="200"/>
+      </w:pPr>
+      <w:r>
+        <w:rPr>
+          <w:rFonts w:ascii="Arial" w:hAnsi="Arial" w:cs="Arial" w:eastAsia="Arial"/>
+          <w:b/>
+          <w:color w:val="1F3A5F"/>
+          <w:sz w:val="26"/>
+        </w:rPr>
         <w:t>Step 4: Verify sync end to end</w:t>
       </w:r>
     </w:p>
@@ -11337,6 +11523,38 @@
                 <w:sz w:val="20"/>
               </w:rPr>
               <w:t>What to do</w:t>
+            </w:r>
+          </w:p>
+        </w:tc>
+      </w:tr>
+      <w:tr>
+        <w:tc>
+          <w:tcPr>
+            <w:tcW w:type="dxa" w:w="4677"/>
+          </w:tcPr>
+          <w:p>
+            <w:r>
+              <w:rPr>
+                <w:rFonts w:ascii="Arial" w:hAnsi="Arial" w:cs="Arial" w:eastAsia="Arial"/>
+                <w:color w:val="000000"/>
+                <w:sz w:val="20"/>
+              </w:rPr>
+              <w:t>Test computers now says Cannot receive or names a firewall</w:t>
+            </w:r>
+          </w:p>
+        </w:tc>
+        <w:tc>
+          <w:tcPr>
+            <w:tcW w:type="dxa" w:w="4677"/>
+          </w:tcPr>
+          <w:p>
+            <w:r>
+              <w:rPr>
+                <w:rFonts w:ascii="Arial" w:hAnsi="Arial" w:cs="Arial" w:eastAsia="Arial"/>
+                <w:color w:val="000000"/>
+                <w:sz w:val="20"/>
+              </w:rPr>
+              <w:t>The engine used Test computers now to check itself first and the ports are blocked on this machine. Allow them: on Linux, run sudo ufw allow 43888/tcp and sudo ufw allow 54321/udp; on Windows, run the netsh advfirewall command shown in the result. Then press Test computers now again.</w:t>
             </w:r>
           </w:p>
         </w:tc>
@@ -11401,6 +11619,38 @@
                 <w:sz w:val="20"/>
               </w:rPr>
               <w:t>Confirm PC 1 shows Online. PC 2 pulls from PC 1; if PC 1 is off, PC 2 counts on its last data or shows Offline Mode.</w:t>
+            </w:r>
+          </w:p>
+        </w:tc>
+      </w:tr>
+      <w:tr>
+        <w:tc>
+          <w:tcPr>
+            <w:tcW w:type="dxa" w:w="4677"/>
+          </w:tcPr>
+          <w:p>
+            <w:r>
+              <w:rPr>
+                <w:rFonts w:ascii="Arial" w:hAnsi="Arial" w:cs="Arial" w:eastAsia="Arial"/>
+                <w:color w:val="000000"/>
+                <w:sz w:val="20"/>
+              </w:rPr>
+              <w:t>The computers refuse to pair automatically</w:t>
+            </w:r>
+          </w:p>
+        </w:tc>
+        <w:tc>
+          <w:tcPr>
+            <w:tcW w:type="dxa" w:w="4677"/>
+          </w:tcPr>
+          <w:p>
+            <w:r>
+              <w:rPr>
+                <w:rFonts w:ascii="Arial" w:hAnsi="Arial" w:cs="Arial" w:eastAsia="Arial"/>
+                <w:color w:val="000000"/>
+                <w:sz w:val="20"/>
+              </w:rPr>
+              <w:t>Join them by PIN: PC 1 presses Generate PIN, PC 2 types it and presses Join (see Connect by PIN above). Both ways install the same security; check both fingerprints agree afterwards.</w:t>
             </w:r>
           </w:p>
         </w:tc>

</xml_diff>

<commit_message>
Bump version to 0.82.14 and update related configurations
- Updated version number in Cargo.toml and tauri.conf.json to 0.82.14.
- Changed APP_VERSION constant in settings/page.tsx to match the new version.
- Added tests for the "Undo this edit" functionality in TodaClient.edit-undo.test.tsx.
- Implemented undo functionality in TodaClient.tsx, allowing users to revert edits through both the success toast and history dialog.
- Enhanced the OfficeAccounts component to allow role changes with confirmation dialogs.
- Updated the PASADA Software Manual to include instructions on the new undo feature and role management.
</commit_message>
<xml_diff>
--- a/manual_assets/PASADA_Software_Manual_Guide.docx
+++ b/manual_assets/PASADA_Software_Manual_Guide.docx
@@ -55,6 +55,46 @@
         <w:t>The complete guide to the franchise registry system for municipal tricycle operators</w:t>
       </w:r>
     </w:p>
+    <w:p>
+      <w:pPr>
+        <w:jc w:val="center"/>
+      </w:pPr>
+      <w:r>
+        <w:drawing>
+          <wp:inline xmlns:a="http://schemas.openxmlformats.org/drawingml/2006/main" xmlns:pic="http://schemas.openxmlformats.org/drawingml/2006/picture">
+            <wp:extent cx="1224000" cy="1224000"/>
+            <wp:docPr id="1" name="Picture 1"/>
+            <wp:cNvGraphicFramePr>
+              <a:graphicFrameLocks noChangeAspect="1"/>
+            </wp:cNvGraphicFramePr>
+            <a:graphic>
+              <a:graphicData uri="http://schemas.openxmlformats.org/drawingml/2006/picture">
+                <pic:pic>
+                  <pic:nvPicPr>
+                    <pic:cNvPr id="0" name="TFRU.png"/>
+                    <pic:cNvPicPr/>
+                  </pic:nvPicPr>
+                  <pic:blipFill>
+                    <a:blip r:embed="rId9"/>
+                    <a:stretch>
+                      <a:fillRect/>
+                    </a:stretch>
+                  </pic:blipFill>
+                  <pic:spPr>
+                    <a:xfrm>
+                      <a:off x="0" y="0"/>
+                      <a:ext cx="1224000" cy="1224000"/>
+                    </a:xfrm>
+                    <a:prstGeom prst="rect"/>
+                  </pic:spPr>
+                </pic:pic>
+              </a:graphicData>
+            </a:graphic>
+          </wp:inline>
+        </w:drawing>
+      </w:r>
+    </w:p>
+    <w:p/>
     <w:p/>
     <w:p/>
     <w:p/>
@@ -1638,6 +1678,70 @@
     </w:p>
     <w:p>
       <w:pPr>
+        <w:spacing w:before="120" w:after="40"/>
+        <w:jc w:val="center"/>
+      </w:pPr>
+      <w:r>
+        <w:drawing>
+          <wp:inline xmlns:a="http://schemas.openxmlformats.org/drawingml/2006/main" xmlns:pic="http://schemas.openxmlformats.org/drawingml/2006/picture">
+            <wp:extent cx="5580000" cy="3487500"/>
+            <wp:docPr id="2" name="Picture 2"/>
+            <wp:cNvGraphicFramePr>
+              <a:graphicFrameLocks noChangeAspect="1"/>
+            </wp:cNvGraphicFramePr>
+            <a:graphic>
+              <a:graphicData uri="http://schemas.openxmlformats.org/drawingml/2006/picture">
+                <pic:pic>
+                  <pic:nvPicPr>
+                    <pic:cNvPr id="0" name="01_login.png"/>
+                    <pic:cNvPicPr/>
+                  </pic:nvPicPr>
+                  <pic:blipFill>
+                    <a:blip r:embed="rId10"/>
+                    <a:stretch>
+                      <a:fillRect/>
+                    </a:stretch>
+                  </pic:blipFill>
+                  <pic:spPr>
+                    <a:xfrm>
+                      <a:off x="0" y="0"/>
+                      <a:ext cx="5580000" cy="3487500"/>
+                    </a:xfrm>
+                    <a:prstGeom prst="rect"/>
+                  </pic:spPr>
+                </pic:pic>
+              </a:graphicData>
+            </a:graphic>
+          </wp:inline>
+        </w:drawing>
+      </w:r>
+    </w:p>
+    <w:p>
+      <w:pPr>
+        <w:spacing w:after="200"/>
+        <w:jc w:val="center"/>
+      </w:pPr>
+      <w:r>
+        <w:rPr>
+          <w:rFonts w:ascii="Arial" w:hAnsi="Arial" w:cs="Arial" w:eastAsia="Arial"/>
+          <w:b/>
+          <w:color w:val="1F3A5F"/>
+          <w:sz w:val="18"/>
+        </w:rPr>
+        <w:t xml:space="preserve">Figure 1. </w:t>
+      </w:r>
+      <w:r>
+        <w:rPr>
+          <w:rFonts w:ascii="Arial" w:hAnsi="Arial" w:cs="Arial" w:eastAsia="Arial"/>
+          <w:i/>
+          <w:color w:val="000000"/>
+          <w:sz w:val="18"/>
+        </w:rPr>
+        <w:t>The log-in screen. Everything starts here.</w:t>
+      </w:r>
+    </w:p>
+    <w:p>
+      <w:pPr>
         <w:spacing w:after="80" w:before="200"/>
       </w:pPr>
       <w:r>
@@ -1923,6 +2027,70 @@
           <w:sz w:val="21"/>
         </w:rPr>
         <w:t>The very first time PASADA runs, the Register Account button appears on the log-in screen. One person creates the first account. Registration then closes for good. From then on, new accounts are created by the admin, inside the program. This is deliberate: an open registration would let anyone who touches the computer create an account on the office registry.</w:t>
+      </w:r>
+    </w:p>
+    <w:p>
+      <w:pPr>
+        <w:spacing w:before="120" w:after="40"/>
+        <w:jc w:val="center"/>
+      </w:pPr>
+      <w:r>
+        <w:drawing>
+          <wp:inline xmlns:a="http://schemas.openxmlformats.org/drawingml/2006/main" xmlns:pic="http://schemas.openxmlformats.org/drawingml/2006/picture">
+            <wp:extent cx="5580000" cy="3487500"/>
+            <wp:docPr id="3" name="Picture 3"/>
+            <wp:cNvGraphicFramePr>
+              <a:graphicFrameLocks noChangeAspect="1"/>
+            </wp:cNvGraphicFramePr>
+            <a:graphic>
+              <a:graphicData uri="http://schemas.openxmlformats.org/drawingml/2006/picture">
+                <pic:pic>
+                  <pic:nvPicPr>
+                    <pic:cNvPr id="0" name="02_register.png"/>
+                    <pic:cNvPicPr/>
+                  </pic:nvPicPr>
+                  <pic:blipFill>
+                    <a:blip r:embed="rId11"/>
+                    <a:stretch>
+                      <a:fillRect/>
+                    </a:stretch>
+                  </pic:blipFill>
+                  <pic:spPr>
+                    <a:xfrm>
+                      <a:off x="0" y="0"/>
+                      <a:ext cx="5580000" cy="3487500"/>
+                    </a:xfrm>
+                    <a:prstGeom prst="rect"/>
+                  </pic:spPr>
+                </pic:pic>
+              </a:graphicData>
+            </a:graphic>
+          </wp:inline>
+        </w:drawing>
+      </w:r>
+    </w:p>
+    <w:p>
+      <w:pPr>
+        <w:spacing w:after="200"/>
+        <w:jc w:val="center"/>
+      </w:pPr>
+      <w:r>
+        <w:rPr>
+          <w:rFonts w:ascii="Arial" w:hAnsi="Arial" w:cs="Arial" w:eastAsia="Arial"/>
+          <w:b/>
+          <w:color w:val="1F3A5F"/>
+          <w:sz w:val="18"/>
+        </w:rPr>
+        <w:t xml:space="preserve">Figure 2. </w:t>
+      </w:r>
+      <w:r>
+        <w:rPr>
+          <w:rFonts w:ascii="Arial" w:hAnsi="Arial" w:cs="Arial" w:eastAsia="Arial"/>
+          <w:i/>
+          <w:color w:val="000000"/>
+          <w:sz w:val="18"/>
+        </w:rPr>
+        <w:t>First-run registration. This door closes once an account exists.</w:t>
       </w:r>
     </w:p>
     <w:p>
@@ -3215,6 +3383,70 @@
     </w:p>
     <w:p>
       <w:pPr>
+        <w:spacing w:before="120" w:after="40"/>
+        <w:jc w:val="center"/>
+      </w:pPr>
+      <w:r>
+        <w:drawing>
+          <wp:inline xmlns:a="http://schemas.openxmlformats.org/drawingml/2006/main" xmlns:pic="http://schemas.openxmlformats.org/drawingml/2006/picture">
+            <wp:extent cx="5580000" cy="3487500"/>
+            <wp:docPr id="4" name="Picture 4"/>
+            <wp:cNvGraphicFramePr>
+              <a:graphicFrameLocks noChangeAspect="1"/>
+            </wp:cNvGraphicFramePr>
+            <a:graphic>
+              <a:graphicData uri="http://schemas.openxmlformats.org/drawingml/2006/picture">
+                <pic:pic>
+                  <pic:nvPicPr>
+                    <pic:cNvPr id="0" name="03_dashboard.png"/>
+                    <pic:cNvPicPr/>
+                  </pic:nvPicPr>
+                  <pic:blipFill>
+                    <a:blip r:embed="rId12"/>
+                    <a:stretch>
+                      <a:fillRect/>
+                    </a:stretch>
+                  </pic:blipFill>
+                  <pic:spPr>
+                    <a:xfrm>
+                      <a:off x="0" y="0"/>
+                      <a:ext cx="5580000" cy="3487500"/>
+                    </a:xfrm>
+                    <a:prstGeom prst="rect"/>
+                  </pic:spPr>
+                </pic:pic>
+              </a:graphicData>
+            </a:graphic>
+          </wp:inline>
+        </w:drawing>
+      </w:r>
+    </w:p>
+    <w:p>
+      <w:pPr>
+        <w:spacing w:after="200"/>
+        <w:jc w:val="center"/>
+      </w:pPr>
+      <w:r>
+        <w:rPr>
+          <w:rFonts w:ascii="Arial" w:hAnsi="Arial" w:cs="Arial" w:eastAsia="Arial"/>
+          <w:b/>
+          <w:color w:val="1F3A5F"/>
+          <w:sz w:val="18"/>
+        </w:rPr>
+        <w:t xml:space="preserve">Figure 3. </w:t>
+      </w:r>
+      <w:r>
+        <w:rPr>
+          <w:rFonts w:ascii="Arial" w:hAnsi="Arial" w:cs="Arial" w:eastAsia="Arial"/>
+          <w:i/>
+          <w:color w:val="000000"/>
+          <w:sz w:val="18"/>
+        </w:rPr>
+        <w:t>The dashboard: totals, volume charts, compliance ring, and route distribution.</w:t>
+      </w:r>
+    </w:p>
+    <w:p>
+      <w:pPr>
         <w:spacing w:after="80" w:before="200"/>
       </w:pPr>
       <w:r>
@@ -3650,6 +3882,70 @@
           <w:sz w:val="21"/>
         </w:rPr>
         <w:t>Click the pin button beside a line to keep it at the top of your list.</w:t>
+      </w:r>
+    </w:p>
+    <w:p>
+      <w:pPr>
+        <w:spacing w:before="120" w:after="40"/>
+        <w:jc w:val="center"/>
+      </w:pPr>
+      <w:r>
+        <w:drawing>
+          <wp:inline xmlns:a="http://schemas.openxmlformats.org/drawingml/2006/main" xmlns:pic="http://schemas.openxmlformats.org/drawingml/2006/picture">
+            <wp:extent cx="5580000" cy="3487500"/>
+            <wp:docPr id="5" name="Picture 5"/>
+            <wp:cNvGraphicFramePr>
+              <a:graphicFrameLocks noChangeAspect="1"/>
+            </wp:cNvGraphicFramePr>
+            <a:graphic>
+              <a:graphicData uri="http://schemas.openxmlformats.org/drawingml/2006/picture">
+                <pic:pic>
+                  <pic:nvPicPr>
+                    <pic:cNvPr id="0" name="04_route_list.png"/>
+                    <pic:cNvPicPr/>
+                  </pic:nvPicPr>
+                  <pic:blipFill>
+                    <a:blip r:embed="rId13"/>
+                    <a:stretch>
+                      <a:fillRect/>
+                    </a:stretch>
+                  </pic:blipFill>
+                  <pic:spPr>
+                    <a:xfrm>
+                      <a:off x="0" y="0"/>
+                      <a:ext cx="5580000" cy="3487500"/>
+                    </a:xfrm>
+                    <a:prstGeom prst="rect"/>
+                  </pic:spPr>
+                </pic:pic>
+              </a:graphicData>
+            </a:graphic>
+          </wp:inline>
+        </w:drawing>
+      </w:r>
+    </w:p>
+    <w:p>
+      <w:pPr>
+        <w:spacing w:after="200"/>
+        <w:jc w:val="center"/>
+      </w:pPr>
+      <w:r>
+        <w:rPr>
+          <w:rFonts w:ascii="Arial" w:hAnsi="Arial" w:cs="Arial" w:eastAsia="Arial"/>
+          <w:b/>
+          <w:color w:val="1F3A5F"/>
+          <w:sz w:val="18"/>
+        </w:rPr>
+        <w:t xml:space="preserve">Figure 4. </w:t>
+      </w:r>
+      <w:r>
+        <w:rPr>
+          <w:rFonts w:ascii="Arial" w:hAnsi="Arial" w:cs="Arial" w:eastAsia="Arial"/>
+          <w:i/>
+          <w:color w:val="000000"/>
+          <w:sz w:val="18"/>
+        </w:rPr>
+        <w:t>A TODA line: search, sort, export, batch print, and Add Operator.</w:t>
       </w:r>
     </w:p>
     <w:p>
@@ -4468,7 +4764,7 @@
           <w:color w:val="1F3A5F"/>
           <w:sz w:val="26"/>
         </w:rPr>
-        <w:t>Deleting and restoring</w:t>
+        <w:t>Undoing a mistake in an edit</w:t>
       </w:r>
     </w:p>
     <w:p>
@@ -4483,21 +4779,7 @@
           <w:color w:val="000000"/>
           <w:sz w:val="21"/>
         </w:rPr>
-        <w:t>The trash icon deletes one operator; tick checkboxes and use the delete-selected control for many at once. Deleted records are not destroyed. They move to the deleted list, and the Undo button that appears right after a delete brings records back immediately. Older deletions are restored by the admin (Chapter 9).</w:t>
-      </w:r>
-    </w:p>
-    <w:p>
-      <w:pPr>
-        <w:spacing w:after="80" w:before="200"/>
-      </w:pPr>
-      <w:r>
-        <w:rPr>
-          <w:rFonts w:ascii="Arial" w:hAnsi="Arial" w:cs="Arial" w:eastAsia="Arial"/>
-          <w:b/>
-          <w:color w:val="1F3A5F"/>
-          <w:sz w:val="26"/>
-        </w:rPr>
-        <w:t>Printing certificates</w:t>
+        <w:t>Every edit can be undone, not just deletions. Two ways:</w:t>
       </w:r>
     </w:p>
     <w:p>
@@ -4511,7 +4793,7 @@
           <w:color w:val="000000"/>
           <w:sz w:val="21"/>
         </w:rPr>
-        <w:t>Eye icon: open the record, then download the MTOP certificate as Word or PDF.</w:t>
+        <w:t>Right after saving: the green confirmation message shows an Undo Changes button at its right side. Click it before touching anything else, and the record is put back exactly as it was before that save.</w:t>
       </w:r>
     </w:p>
     <w:p>
@@ -4525,35 +4807,7 @@
           <w:color w:val="000000"/>
           <w:sz w:val="21"/>
         </w:rPr>
-        <w:t>Printer icon on a row: download that record's certificate directly.</w:t>
-      </w:r>
-    </w:p>
-    <w:p>
-      <w:pPr>
-        <w:pStyle w:val="ListBullet"/>
-        <w:spacing w:after="60"/>
-      </w:pPr>
-      <w:r>
-        <w:rPr>
-          <w:rFonts w:ascii="Arial" w:hAnsi="Arial" w:cs="Arial" w:eastAsia="Arial"/>
-          <w:color w:val="000000"/>
-          <w:sz w:val="21"/>
-        </w:rPr>
-        <w:t>Batch Print: tick several rows first, then merge many certificates into one PDF for the office printer.</w:t>
-      </w:r>
-    </w:p>
-    <w:p>
-      <w:pPr>
-        <w:spacing w:after="80" w:before="200"/>
-      </w:pPr>
-      <w:r>
-        <w:rPr>
-          <w:rFonts w:ascii="Arial" w:hAnsi="Arial" w:cs="Arial" w:eastAsia="Arial"/>
-          <w:b/>
-          <w:color w:val="1F3A5F"/>
-          <w:sz w:val="26"/>
-        </w:rPr>
-        <w:t>Exporting Excel</w:t>
+        <w:t>Any time later: the record's History dialog (the clock icon) lists every change. Each entry that carries saved earlier values has an amber Undo this edit button beside it. Clicking it puts the record back to the values it had right before that entry, no matter how many edits came after.</w:t>
       </w:r>
     </w:p>
     <w:p>
@@ -4568,6 +4822,224 @@
           <w:color w:val="000000"/>
           <w:sz w:val="21"/>
         </w:rPr>
+        <w:t>While the undo is running the button shows a spinner and cannot be clicked twice. If the undo cannot happen (for example, the old SBN is now used by another record on the same computer), the message says so in plain words and changes nothing — the record stays exactly as it is. Undo actions themselves are written to the Activity History, so the office can always see what came back.</w:t>
+      </w:r>
+    </w:p>
+    <w:tbl>
+      <w:tblPr>
+        <w:tblW w:type="auto" w:w="0"/>
+        <w:jc w:val="center"/>
+        <w:tblLook w:firstColumn="1" w:firstRow="1" w:lastColumn="0" w:lastRow="0" w:noHBand="0" w:noVBand="1" w:val="04A0"/>
+      </w:tblPr>
+      <w:tblGrid>
+        <w:gridCol w:w="9355"/>
+      </w:tblGrid>
+      <w:tr>
+        <w:tc>
+          <w:tcPr>
+            <w:tcW w:type="dxa" w:w="9355"/>
+            <w:shd w:val="clear" w:fill="F5F7FA"/>
+          </w:tcPr>
+          <w:p>
+            <w:pPr>
+              <w:spacing w:before="80" w:after="80"/>
+            </w:pPr>
+            <w:r>
+              <w:rPr>
+                <w:rFonts w:ascii="Arial" w:hAnsi="Arial" w:cs="Arial" w:eastAsia="Arial"/>
+                <w:b/>
+                <w:color w:val="1F3A5F"/>
+                <w:sz w:val="20"/>
+              </w:rPr>
+              <w:t xml:space="preserve">NOTE:  </w:t>
+            </w:r>
+            <w:r>
+              <w:rPr>
+                <w:rFonts w:ascii="Arial" w:hAnsi="Arial" w:cs="Arial" w:eastAsia="Arial"/>
+                <w:color w:val="000000"/>
+                <w:sz w:val="20"/>
+              </w:rPr>
+              <w:t>The Undo Changes button lives inside the confirmation message at the bottom of the screen. If the MTOP preview opened right after the save, close the preview first; the message stays a few seconds and is gone before you can miss it.</w:t>
+            </w:r>
+          </w:p>
+        </w:tc>
+      </w:tr>
+    </w:tbl>
+    <w:p>
+      <w:pPr>
+        <w:spacing w:after="80" w:before="200"/>
+      </w:pPr>
+      <w:r>
+        <w:rPr>
+          <w:rFonts w:ascii="Arial" w:hAnsi="Arial" w:cs="Arial" w:eastAsia="Arial"/>
+          <w:b/>
+          <w:color w:val="1F3A5F"/>
+          <w:sz w:val="26"/>
+        </w:rPr>
+        <w:t>Deleting and restoring</w:t>
+      </w:r>
+    </w:p>
+    <w:p>
+      <w:pPr>
+        <w:spacing w:after="120" w:before="0"/>
+      </w:pPr>
+      <w:r>
+        <w:rPr>
+          <w:rFonts w:ascii="Arial" w:hAnsi="Arial" w:cs="Arial" w:eastAsia="Arial"/>
+          <w:b w:val="0"/>
+          <w:i w:val="0"/>
+          <w:color w:val="000000"/>
+          <w:sz w:val="21"/>
+        </w:rPr>
+        <w:t>The trash icon deletes one operator; tick checkboxes and use the delete-selected control for many at once. Deleted records are not destroyed. They move to the deleted list, and the Undo button that appears right after a delete brings records back immediately. Older deletions are restored by the admin (Chapter 9).</w:t>
+      </w:r>
+    </w:p>
+    <w:p>
+      <w:pPr>
+        <w:spacing w:after="80" w:before="200"/>
+      </w:pPr>
+      <w:r>
+        <w:rPr>
+          <w:rFonts w:ascii="Arial" w:hAnsi="Arial" w:cs="Arial" w:eastAsia="Arial"/>
+          <w:b/>
+          <w:color w:val="1F3A5F"/>
+          <w:sz w:val="26"/>
+        </w:rPr>
+        <w:t>Printing certificates</w:t>
+      </w:r>
+    </w:p>
+    <w:p>
+      <w:pPr>
+        <w:pStyle w:val="ListBullet"/>
+        <w:spacing w:after="60"/>
+      </w:pPr>
+      <w:r>
+        <w:rPr>
+          <w:rFonts w:ascii="Arial" w:hAnsi="Arial" w:cs="Arial" w:eastAsia="Arial"/>
+          <w:color w:val="000000"/>
+          <w:sz w:val="21"/>
+        </w:rPr>
+        <w:t>Eye icon: open the record, then download the MTOP certificate as Word or PDF.</w:t>
+      </w:r>
+    </w:p>
+    <w:p>
+      <w:pPr>
+        <w:pStyle w:val="ListBullet"/>
+        <w:spacing w:after="60"/>
+      </w:pPr>
+      <w:r>
+        <w:rPr>
+          <w:rFonts w:ascii="Arial" w:hAnsi="Arial" w:cs="Arial" w:eastAsia="Arial"/>
+          <w:color w:val="000000"/>
+          <w:sz w:val="21"/>
+        </w:rPr>
+        <w:t>Printer icon on a row: download that record's certificate directly.</w:t>
+      </w:r>
+    </w:p>
+    <w:p>
+      <w:pPr>
+        <w:pStyle w:val="ListBullet"/>
+        <w:spacing w:after="60"/>
+      </w:pPr>
+      <w:r>
+        <w:rPr>
+          <w:rFonts w:ascii="Arial" w:hAnsi="Arial" w:cs="Arial" w:eastAsia="Arial"/>
+          <w:color w:val="000000"/>
+          <w:sz w:val="21"/>
+        </w:rPr>
+        <w:t>Batch Print: tick several rows first, then merge many certificates into one PDF for the office printer.</w:t>
+      </w:r>
+    </w:p>
+    <w:p>
+      <w:pPr>
+        <w:spacing w:before="120" w:after="40"/>
+        <w:jc w:val="center"/>
+      </w:pPr>
+      <w:r>
+        <w:drawing>
+          <wp:inline xmlns:a="http://schemas.openxmlformats.org/drawingml/2006/main" xmlns:pic="http://schemas.openxmlformats.org/drawingml/2006/picture">
+            <wp:extent cx="5580000" cy="3487500"/>
+            <wp:docPr id="6" name="Picture 6"/>
+            <wp:cNvGraphicFramePr>
+              <a:graphicFrameLocks noChangeAspect="1"/>
+            </wp:cNvGraphicFramePr>
+            <a:graphic>
+              <a:graphicData uri="http://schemas.openxmlformats.org/drawingml/2006/picture">
+                <pic:pic>
+                  <pic:nvPicPr>
+                    <pic:cNvPr id="0" name="05_search.png"/>
+                    <pic:cNvPicPr/>
+                  </pic:nvPicPr>
+                  <pic:blipFill>
+                    <a:blip r:embed="rId14"/>
+                    <a:stretch>
+                      <a:fillRect/>
+                    </a:stretch>
+                  </pic:blipFill>
+                  <pic:spPr>
+                    <a:xfrm>
+                      <a:off x="0" y="0"/>
+                      <a:ext cx="5580000" cy="3487500"/>
+                    </a:xfrm>
+                    <a:prstGeom prst="rect"/>
+                  </pic:spPr>
+                </pic:pic>
+              </a:graphicData>
+            </a:graphic>
+          </wp:inline>
+        </w:drawing>
+      </w:r>
+    </w:p>
+    <w:p>
+      <w:pPr>
+        <w:spacing w:after="200"/>
+        <w:jc w:val="center"/>
+      </w:pPr>
+      <w:r>
+        <w:rPr>
+          <w:rFonts w:ascii="Arial" w:hAnsi="Arial" w:cs="Arial" w:eastAsia="Arial"/>
+          <w:b/>
+          <w:color w:val="1F3A5F"/>
+          <w:sz w:val="18"/>
+        </w:rPr>
+        <w:t xml:space="preserve">Figure 5. </w:t>
+      </w:r>
+      <w:r>
+        <w:rPr>
+          <w:rFonts w:ascii="Arial" w:hAnsi="Arial" w:cs="Arial" w:eastAsia="Arial"/>
+          <w:i/>
+          <w:color w:val="000000"/>
+          <w:sz w:val="18"/>
+        </w:rPr>
+        <w:t>Search across every line at once. Press / on any page to jump here.</w:t>
+      </w:r>
+    </w:p>
+    <w:p>
+      <w:pPr>
+        <w:spacing w:after="80" w:before="200"/>
+      </w:pPr>
+      <w:r>
+        <w:rPr>
+          <w:rFonts w:ascii="Arial" w:hAnsi="Arial" w:cs="Arial" w:eastAsia="Arial"/>
+          <w:b/>
+          <w:color w:val="1F3A5F"/>
+          <w:sz w:val="26"/>
+        </w:rPr>
+        <w:t>Exporting Excel</w:t>
+      </w:r>
+    </w:p>
+    <w:p>
+      <w:pPr>
+        <w:spacing w:after="120" w:before="0"/>
+      </w:pPr>
+      <w:r>
+        <w:rPr>
+          <w:rFonts w:ascii="Arial" w:hAnsi="Arial" w:cs="Arial" w:eastAsia="Arial"/>
+          <w:b w:val="0"/>
+          <w:i w:val="0"/>
+          <w:color w:val="000000"/>
+          <w:sz w:val="21"/>
+        </w:rPr>
         <w:t>Export Excel on a line's page downloads that line. The Activity History page exports its own filtered logs as Excel. The dashboard prints the TODA Renewal Summary. Every export lands in the Activity History.</w:t>
       </w:r>
     </w:p>
@@ -4737,6 +5209,70 @@
           <w:sz w:val="21"/>
         </w:rPr>
         <w:t>The Activity History page lists every change made in PASADA: log-ins, edits, renewals, deletions, restorations, exports, prints, account changes, ticket approvals. Each line shows when it happened, who did it, the action, the record it touched, and the details including old and new values.</w:t>
+      </w:r>
+    </w:p>
+    <w:p>
+      <w:pPr>
+        <w:spacing w:before="120" w:after="40"/>
+        <w:jc w:val="center"/>
+      </w:pPr>
+      <w:r>
+        <w:drawing>
+          <wp:inline xmlns:a="http://schemas.openxmlformats.org/drawingml/2006/main" xmlns:pic="http://schemas.openxmlformats.org/drawingml/2006/picture">
+            <wp:extent cx="5580000" cy="3487500"/>
+            <wp:docPr id="7" name="Picture 7"/>
+            <wp:cNvGraphicFramePr>
+              <a:graphicFrameLocks noChangeAspect="1"/>
+            </wp:cNvGraphicFramePr>
+            <a:graphic>
+              <a:graphicData uri="http://schemas.openxmlformats.org/drawingml/2006/picture">
+                <pic:pic>
+                  <pic:nvPicPr>
+                    <pic:cNvPr id="0" name="06_activity.png"/>
+                    <pic:cNvPicPr/>
+                  </pic:nvPicPr>
+                  <pic:blipFill>
+                    <a:blip r:embed="rId15"/>
+                    <a:stretch>
+                      <a:fillRect/>
+                    </a:stretch>
+                  </pic:blipFill>
+                  <pic:spPr>
+                    <a:xfrm>
+                      <a:off x="0" y="0"/>
+                      <a:ext cx="5580000" cy="3487500"/>
+                    </a:xfrm>
+                    <a:prstGeom prst="rect"/>
+                  </pic:spPr>
+                </pic:pic>
+              </a:graphicData>
+            </a:graphic>
+          </wp:inline>
+        </w:drawing>
+      </w:r>
+    </w:p>
+    <w:p>
+      <w:pPr>
+        <w:spacing w:after="200"/>
+        <w:jc w:val="center"/>
+      </w:pPr>
+      <w:r>
+        <w:rPr>
+          <w:rFonts w:ascii="Arial" w:hAnsi="Arial" w:cs="Arial" w:eastAsia="Arial"/>
+          <w:b/>
+          <w:color w:val="1F3A5F"/>
+          <w:sz w:val="18"/>
+        </w:rPr>
+        <w:t xml:space="preserve">Figure 6. </w:t>
+      </w:r>
+      <w:r>
+        <w:rPr>
+          <w:rFonts w:ascii="Arial" w:hAnsi="Arial" w:cs="Arial" w:eastAsia="Arial"/>
+          <w:i/>
+          <w:color w:val="000000"/>
+          <w:sz w:val="18"/>
+        </w:rPr>
+        <w:t>Activity History: the office's complete record of changes.</w:t>
       </w:r>
     </w:p>
     <w:p>
@@ -5042,6 +5578,70 @@
     </w:p>
     <w:p>
       <w:pPr>
+        <w:spacing w:before="120" w:after="40"/>
+        <w:jc w:val="center"/>
+      </w:pPr>
+      <w:r>
+        <w:drawing>
+          <wp:inline xmlns:a="http://schemas.openxmlformats.org/drawingml/2006/main" xmlns:pic="http://schemas.openxmlformats.org/drawingml/2006/picture">
+            <wp:extent cx="5580000" cy="3487500"/>
+            <wp:docPr id="8" name="Picture 8"/>
+            <wp:cNvGraphicFramePr>
+              <a:graphicFrameLocks noChangeAspect="1"/>
+            </wp:cNvGraphicFramePr>
+            <a:graphic>
+              <a:graphicData uri="http://schemas.openxmlformats.org/drawingml/2006/picture">
+                <pic:pic>
+                  <pic:nvPicPr>
+                    <pic:cNvPr id="0" name="07_inactive.png"/>
+                    <pic:cNvPicPr/>
+                  </pic:nvPicPr>
+                  <pic:blipFill>
+                    <a:blip r:embed="rId16"/>
+                    <a:stretch>
+                      <a:fillRect/>
+                    </a:stretch>
+                  </pic:blipFill>
+                  <pic:spPr>
+                    <a:xfrm>
+                      <a:off x="0" y="0"/>
+                      <a:ext cx="5580000" cy="3487500"/>
+                    </a:xfrm>
+                    <a:prstGeom prst="rect"/>
+                  </pic:spPr>
+                </pic:pic>
+              </a:graphicData>
+            </a:graphic>
+          </wp:inline>
+        </w:drawing>
+      </w:r>
+    </w:p>
+    <w:p>
+      <w:pPr>
+        <w:spacing w:after="200"/>
+        <w:jc w:val="center"/>
+      </w:pPr>
+      <w:r>
+        <w:rPr>
+          <w:rFonts w:ascii="Arial" w:hAnsi="Arial" w:cs="Arial" w:eastAsia="Arial"/>
+          <w:b/>
+          <w:color w:val="1F3A5F"/>
+          <w:sz w:val="18"/>
+        </w:rPr>
+        <w:t xml:space="preserve">Figure 7. </w:t>
+      </w:r>
+      <w:r>
+        <w:rPr>
+          <w:rFonts w:ascii="Arial" w:hAnsi="Arial" w:cs="Arial" w:eastAsia="Arial"/>
+          <w:i/>
+          <w:color w:val="000000"/>
+          <w:sz w:val="18"/>
+        </w:rPr>
+        <w:t>Inactive operators: candidates for reassignment.</w:t>
+      </w:r>
+    </w:p>
+    <w:p>
+      <w:pPr>
         <w:spacing w:after="80" w:before="200"/>
       </w:pPr>
       <w:r>
@@ -5190,6 +5790,70 @@
           <w:sz w:val="21"/>
         </w:rPr>
         <w:t>Click Import. A summary reports rows added, updated, or skipped, and any row-level errors.</w:t>
+      </w:r>
+    </w:p>
+    <w:p>
+      <w:pPr>
+        <w:spacing w:before="120" w:after="40"/>
+        <w:jc w:val="center"/>
+      </w:pPr>
+      <w:r>
+        <w:drawing>
+          <wp:inline xmlns:a="http://schemas.openxmlformats.org/drawingml/2006/main" xmlns:pic="http://schemas.openxmlformats.org/drawingml/2006/picture">
+            <wp:extent cx="5580000" cy="3487500"/>
+            <wp:docPr id="9" name="Picture 9"/>
+            <wp:cNvGraphicFramePr>
+              <a:graphicFrameLocks noChangeAspect="1"/>
+            </wp:cNvGraphicFramePr>
+            <a:graphic>
+              <a:graphicData uri="http://schemas.openxmlformats.org/drawingml/2006/picture">
+                <pic:pic>
+                  <pic:nvPicPr>
+                    <pic:cNvPr id="0" name="08_import.png"/>
+                    <pic:cNvPicPr/>
+                  </pic:nvPicPr>
+                  <pic:blipFill>
+                    <a:blip r:embed="rId17"/>
+                    <a:stretch>
+                      <a:fillRect/>
+                    </a:stretch>
+                  </pic:blipFill>
+                  <pic:spPr>
+                    <a:xfrm>
+                      <a:off x="0" y="0"/>
+                      <a:ext cx="5580000" cy="3487500"/>
+                    </a:xfrm>
+                    <a:prstGeom prst="rect"/>
+                  </pic:spPr>
+                </pic:pic>
+              </a:graphicData>
+            </a:graphic>
+          </wp:inline>
+        </w:drawing>
+      </w:r>
+    </w:p>
+    <w:p>
+      <w:pPr>
+        <w:spacing w:after="200"/>
+        <w:jc w:val="center"/>
+      </w:pPr>
+      <w:r>
+        <w:rPr>
+          <w:rFonts w:ascii="Arial" w:hAnsi="Arial" w:cs="Arial" w:eastAsia="Arial"/>
+          <w:b/>
+          <w:color w:val="1F3A5F"/>
+          <w:sz w:val="18"/>
+        </w:rPr>
+        <w:t xml:space="preserve">Figure 8. </w:t>
+      </w:r>
+      <w:r>
+        <w:rPr>
+          <w:rFonts w:ascii="Arial" w:hAnsi="Arial" w:cs="Arial" w:eastAsia="Arial"/>
+          <w:i/>
+          <w:color w:val="000000"/>
+          <w:sz w:val="18"/>
+        </w:rPr>
+        <w:t>Import Records: pick the file, check the preview, confirm.</w:t>
       </w:r>
     </w:p>
     <w:tbl>
@@ -5356,6 +6020,70 @@
           <w:bottom w:val="single" w:sz="12" w:space="1" w:color="1F3A5F"/>
         </w:pBdr>
       </w:pPr>
+    </w:p>
+    <w:p>
+      <w:pPr>
+        <w:spacing w:before="120" w:after="40"/>
+        <w:jc w:val="center"/>
+      </w:pPr>
+      <w:r>
+        <w:drawing>
+          <wp:inline xmlns:a="http://schemas.openxmlformats.org/drawingml/2006/main" xmlns:pic="http://schemas.openxmlformats.org/drawingml/2006/picture">
+            <wp:extent cx="5580000" cy="3487500"/>
+            <wp:docPr id="10" name="Picture 10"/>
+            <wp:cNvGraphicFramePr>
+              <a:graphicFrameLocks noChangeAspect="1"/>
+            </wp:cNvGraphicFramePr>
+            <a:graphic>
+              <a:graphicData uri="http://schemas.openxmlformats.org/drawingml/2006/picture">
+                <pic:pic>
+                  <pic:nvPicPr>
+                    <pic:cNvPr id="0" name="09_settings.png"/>
+                    <pic:cNvPicPr/>
+                  </pic:nvPicPr>
+                  <pic:blipFill>
+                    <a:blip r:embed="rId18"/>
+                    <a:stretch>
+                      <a:fillRect/>
+                    </a:stretch>
+                  </pic:blipFill>
+                  <pic:spPr>
+                    <a:xfrm>
+                      <a:off x="0" y="0"/>
+                      <a:ext cx="5580000" cy="3487500"/>
+                    </a:xfrm>
+                    <a:prstGeom prst="rect"/>
+                  </pic:spPr>
+                </pic:pic>
+              </a:graphicData>
+            </a:graphic>
+          </wp:inline>
+        </w:drawing>
+      </w:r>
+    </w:p>
+    <w:p>
+      <w:pPr>
+        <w:spacing w:after="200"/>
+        <w:jc w:val="center"/>
+      </w:pPr>
+      <w:r>
+        <w:rPr>
+          <w:rFonts w:ascii="Arial" w:hAnsi="Arial" w:cs="Arial" w:eastAsia="Arial"/>
+          <w:b/>
+          <w:color w:val="1F3A5F"/>
+          <w:sz w:val="18"/>
+        </w:rPr>
+        <w:t xml:space="preserve">Figure 9. </w:t>
+      </w:r>
+      <w:r>
+        <w:rPr>
+          <w:rFonts w:ascii="Arial" w:hAnsi="Arial" w:cs="Arial" w:eastAsia="Arial"/>
+          <w:i/>
+          <w:color w:val="000000"/>
+          <w:sz w:val="18"/>
+        </w:rPr>
+        <w:t>Settings: office details, preferences, security, backups, updates.</w:t>
+      </w:r>
     </w:p>
     <w:p>
       <w:pPr>
@@ -5915,6 +6643,70 @@
     </w:p>
     <w:p>
       <w:pPr>
+        <w:spacing w:before="120" w:after="40"/>
+        <w:jc w:val="center"/>
+      </w:pPr>
+      <w:r>
+        <w:drawing>
+          <wp:inline xmlns:a="http://schemas.openxmlformats.org/drawingml/2006/main" xmlns:pic="http://schemas.openxmlformats.org/drawingml/2006/picture">
+            <wp:extent cx="5580000" cy="3487500"/>
+            <wp:docPr id="11" name="Picture 11"/>
+            <wp:cNvGraphicFramePr>
+              <a:graphicFrameLocks noChangeAspect="1"/>
+            </wp:cNvGraphicFramePr>
+            <a:graphic>
+              <a:graphicData uri="http://schemas.openxmlformats.org/drawingml/2006/picture">
+                <pic:pic>
+                  <pic:nvPicPr>
+                    <pic:cNvPr id="0" name="10_admin_gate.png"/>
+                    <pic:cNvPicPr/>
+                  </pic:nvPicPr>
+                  <pic:blipFill>
+                    <a:blip r:embed="rId19"/>
+                    <a:stretch>
+                      <a:fillRect/>
+                    </a:stretch>
+                  </pic:blipFill>
+                  <pic:spPr>
+                    <a:xfrm>
+                      <a:off x="0" y="0"/>
+                      <a:ext cx="5580000" cy="3487500"/>
+                    </a:xfrm>
+                    <a:prstGeom prst="rect"/>
+                  </pic:spPr>
+                </pic:pic>
+              </a:graphicData>
+            </a:graphic>
+          </wp:inline>
+        </w:drawing>
+      </w:r>
+    </w:p>
+    <w:p>
+      <w:pPr>
+        <w:spacing w:after="200"/>
+        <w:jc w:val="center"/>
+      </w:pPr>
+      <w:r>
+        <w:rPr>
+          <w:rFonts w:ascii="Arial" w:hAnsi="Arial" w:cs="Arial" w:eastAsia="Arial"/>
+          <w:b/>
+          <w:color w:val="1F3A5F"/>
+          <w:sz w:val="18"/>
+        </w:rPr>
+        <w:t xml:space="preserve">Figure 10. </w:t>
+      </w:r>
+      <w:r>
+        <w:rPr>
+          <w:rFonts w:ascii="Arial" w:hAnsi="Arial" w:cs="Arial" w:eastAsia="Arial"/>
+          <w:i/>
+          <w:color w:val="000000"/>
+          <w:sz w:val="18"/>
+        </w:rPr>
+        <w:t>Non-admins see this refusal screen instead of the console.</w:t>
+      </w:r>
+    </w:p>
+    <w:p>
+      <w:pPr>
         <w:spacing w:after="80" w:before="200"/>
       </w:pPr>
       <w:r>
@@ -5944,6 +6736,70 @@
     </w:p>
     <w:p>
       <w:pPr>
+        <w:spacing w:before="120" w:after="40"/>
+        <w:jc w:val="center"/>
+      </w:pPr>
+      <w:r>
+        <w:drawing>
+          <wp:inline xmlns:a="http://schemas.openxmlformats.org/drawingml/2006/main" xmlns:pic="http://schemas.openxmlformats.org/drawingml/2006/picture">
+            <wp:extent cx="5580000" cy="3487500"/>
+            <wp:docPr id="12" name="Picture 12"/>
+            <wp:cNvGraphicFramePr>
+              <a:graphicFrameLocks noChangeAspect="1"/>
+            </wp:cNvGraphicFramePr>
+            <a:graphic>
+              <a:graphicData uri="http://schemas.openxmlformats.org/drawingml/2006/picture">
+                <pic:pic>
+                  <pic:nvPicPr>
+                    <pic:cNvPr id="0" name="11_admin_console.png"/>
+                    <pic:cNvPicPr/>
+                  </pic:nvPicPr>
+                  <pic:blipFill>
+                    <a:blip r:embed="rId20"/>
+                    <a:stretch>
+                      <a:fillRect/>
+                    </a:stretch>
+                  </pic:blipFill>
+                  <pic:spPr>
+                    <a:xfrm>
+                      <a:off x="0" y="0"/>
+                      <a:ext cx="5580000" cy="3487500"/>
+                    </a:xfrm>
+                    <a:prstGeom prst="rect"/>
+                  </pic:spPr>
+                </pic:pic>
+              </a:graphicData>
+            </a:graphic>
+          </wp:inline>
+        </w:drawing>
+      </w:r>
+    </w:p>
+    <w:p>
+      <w:pPr>
+        <w:spacing w:after="200"/>
+        <w:jc w:val="center"/>
+      </w:pPr>
+      <w:r>
+        <w:rPr>
+          <w:rFonts w:ascii="Arial" w:hAnsi="Arial" w:cs="Arial" w:eastAsia="Arial"/>
+          <w:b/>
+          <w:color w:val="1F3A5F"/>
+          <w:sz w:val="18"/>
+        </w:rPr>
+        <w:t xml:space="preserve">Figure 11. </w:t>
+      </w:r>
+      <w:r>
+        <w:rPr>
+          <w:rFonts w:ascii="Arial" w:hAnsi="Arial" w:cs="Arial" w:eastAsia="Arial"/>
+          <w:i/>
+          <w:color w:val="000000"/>
+          <w:sz w:val="18"/>
+        </w:rPr>
+        <w:t>The Admin Console: four tabs, one place for everything admin.</w:t>
+      </w:r>
+    </w:p>
+    <w:p>
+      <w:pPr>
         <w:spacing w:after="80" w:before="200"/>
       </w:pPr>
       <w:r>
@@ -6013,6 +6869,70 @@
           <w:sz w:val="21"/>
         </w:rPr>
         <w:t>The two-key rule covers the Admin too. Deleting a route, renaming a route, restoring deleted records, and deactivating an account always become tickets, even when an Admin clicks them. Nobody can approve their own request. The one exception: an office with a single active Admin executes right away, but must type a reason, and the audit log records it. Every office always keeps at least one working Admin.</w:t>
+      </w:r>
+    </w:p>
+    <w:p>
+      <w:pPr>
+        <w:spacing w:before="120" w:after="40"/>
+        <w:jc w:val="center"/>
+      </w:pPr>
+      <w:r>
+        <w:drawing>
+          <wp:inline xmlns:a="http://schemas.openxmlformats.org/drawingml/2006/main" xmlns:pic="http://schemas.openxmlformats.org/drawingml/2006/picture">
+            <wp:extent cx="5580000" cy="3487500"/>
+            <wp:docPr id="13" name="Picture 13"/>
+            <wp:cNvGraphicFramePr>
+              <a:graphicFrameLocks noChangeAspect="1"/>
+            </wp:cNvGraphicFramePr>
+            <a:graphic>
+              <a:graphicData uri="http://schemas.openxmlformats.org/drawingml/2006/picture">
+                <pic:pic>
+                  <pic:nvPicPr>
+                    <pic:cNvPr id="0" name="11_admin_console.png"/>
+                    <pic:cNvPicPr/>
+                  </pic:nvPicPr>
+                  <pic:blipFill>
+                    <a:blip r:embed="rId20"/>
+                    <a:stretch>
+                      <a:fillRect/>
+                    </a:stretch>
+                  </pic:blipFill>
+                  <pic:spPr>
+                    <a:xfrm>
+                      <a:off x="0" y="0"/>
+                      <a:ext cx="5580000" cy="3487500"/>
+                    </a:xfrm>
+                    <a:prstGeom prst="rect"/>
+                  </pic:spPr>
+                </pic:pic>
+              </a:graphicData>
+            </a:graphic>
+          </wp:inline>
+        </w:drawing>
+      </w:r>
+    </w:p>
+    <w:p>
+      <w:pPr>
+        <w:spacing w:after="200"/>
+        <w:jc w:val="center"/>
+      </w:pPr>
+      <w:r>
+        <w:rPr>
+          <w:rFonts w:ascii="Arial" w:hAnsi="Arial" w:cs="Arial" w:eastAsia="Arial"/>
+          <w:b/>
+          <w:color w:val="1F3A5F"/>
+          <w:sz w:val="18"/>
+        </w:rPr>
+        <w:t xml:space="preserve">Figure 12. </w:t>
+      </w:r>
+      <w:r>
+        <w:rPr>
+          <w:rFonts w:ascii="Arial" w:hAnsi="Arial" w:cs="Arial" w:eastAsia="Arial"/>
+          <w:i/>
+          <w:color w:val="000000"/>
+          <w:sz w:val="18"/>
+        </w:rPr>
+        <w:t>The Approvals tab: nothing big happens without a yes here.</w:t>
       </w:r>
     </w:p>
     <w:p>
@@ -6173,6 +7093,70 @@
           <w:sz w:val="26"/>
         </w:rPr>
         <w:t>Technical tab: system health in plain words</w:t>
+      </w:r>
+    </w:p>
+    <w:p>
+      <w:pPr>
+        <w:spacing w:before="120" w:after="40"/>
+        <w:jc w:val="center"/>
+      </w:pPr>
+      <w:r>
+        <w:drawing>
+          <wp:inline xmlns:a="http://schemas.openxmlformats.org/drawingml/2006/main" xmlns:pic="http://schemas.openxmlformats.org/drawingml/2006/picture">
+            <wp:extent cx="5580000" cy="3487500"/>
+            <wp:docPr id="14" name="Picture 14"/>
+            <wp:cNvGraphicFramePr>
+              <a:graphicFrameLocks noChangeAspect="1"/>
+            </wp:cNvGraphicFramePr>
+            <a:graphic>
+              <a:graphicData uri="http://schemas.openxmlformats.org/drawingml/2006/picture">
+                <pic:pic>
+                  <pic:nvPicPr>
+                    <pic:cNvPr id="0" name="11_admin_console.png"/>
+                    <pic:cNvPicPr/>
+                  </pic:nvPicPr>
+                  <pic:blipFill>
+                    <a:blip r:embed="rId20"/>
+                    <a:stretch>
+                      <a:fillRect/>
+                    </a:stretch>
+                  </pic:blipFill>
+                  <pic:spPr>
+                    <a:xfrm>
+                      <a:off x="0" y="0"/>
+                      <a:ext cx="5580000" cy="3487500"/>
+                    </a:xfrm>
+                    <a:prstGeom prst="rect"/>
+                  </pic:spPr>
+                </pic:pic>
+              </a:graphicData>
+            </a:graphic>
+          </wp:inline>
+        </w:drawing>
+      </w:r>
+    </w:p>
+    <w:p>
+      <w:pPr>
+        <w:spacing w:after="200"/>
+        <w:jc w:val="center"/>
+      </w:pPr>
+      <w:r>
+        <w:rPr>
+          <w:rFonts w:ascii="Arial" w:hAnsi="Arial" w:cs="Arial" w:eastAsia="Arial"/>
+          <w:b/>
+          <w:color w:val="1F3A5F"/>
+          <w:sz w:val="18"/>
+        </w:rPr>
+        <w:t xml:space="preserve">Figure 13. </w:t>
+      </w:r>
+      <w:r>
+        <w:rPr>
+          <w:rFonts w:ascii="Arial" w:hAnsi="Arial" w:cs="Arial" w:eastAsia="Arial"/>
+          <w:i/>
+          <w:color w:val="000000"/>
+          <w:sz w:val="18"/>
+        </w:rPr>
+        <w:t>The Technical tab: computer, records, sharing, backup, error notes.</w:t>
       </w:r>
     </w:p>
     <w:p>
@@ -6448,6 +7432,21 @@
           <w:sz w:val="21"/>
         </w:rPr>
         <w:t>Office accounts: create an account by typing a first name, last name, password, and role. Reset a password by choosing the account and typing the new one. Both reach every computer in the office within seconds.</w:t>
+      </w:r>
+    </w:p>
+    <w:p>
+      <w:pPr>
+        <w:spacing w:after="120" w:before="0"/>
+      </w:pPr>
+      <w:r>
+        <w:rPr>
+          <w:rFonts w:ascii="Arial" w:hAnsi="Arial" w:cs="Arial" w:eastAsia="Arial"/>
+          <w:b w:val="0"/>
+          <w:i w:val="0"/>
+          <w:color w:val="000000"/>
+          <w:sz w:val="21"/>
+        </w:rPr>
+        <w:t>Changing a role: in the account table every row's Role column is a dropdown. Pick Clerk, Viewer, or Admin right there, confirm, and the change applies at once and syncs to every office computer within seconds. Two protections are built in: you cannot change the role of the account you are signed in with, and the office always keeps at least one active Admin, so a demotion that would remove the last admin is refused with a plain explanation. The Activity History records who changed whose role, from what to what (Chapter 9 explains what each role may do).</w:t>
       </w:r>
     </w:p>
     <w:p>
@@ -7339,7 +8338,7 @@
           <w:color w:val="000000"/>
           <w:sz w:val="21"/>
         </w:rPr>
-        <w:t>The admin approves (the action runs at once) or rejects with a reason.</w:t>
+        <w:t>Optional but encouraged: while filing, you can type a few words describing the problem or the reason. It appears on the ticket, so the admin can decide without chasing you down. Leaving it empty is allowed.</w:t>
       </w:r>
     </w:p>
     <w:p>
@@ -7355,6 +8354,29 @@
           <w:sz w:val="21"/>
         </w:rPr>
         <w:t xml:space="preserve">5.  </w:t>
+      </w:r>
+      <w:r>
+        <w:rPr>
+          <w:rFonts w:ascii="Arial" w:hAnsi="Arial" w:cs="Arial" w:eastAsia="Arial"/>
+          <w:color w:val="000000"/>
+          <w:sz w:val="21"/>
+        </w:rPr>
+        <w:t>The admin approves (the action runs at once) or rejects with a reason.</w:t>
+      </w:r>
+    </w:p>
+    <w:p>
+      <w:pPr>
+        <w:spacing w:after="80"/>
+        <w:ind w:left="340"/>
+      </w:pPr>
+      <w:r>
+        <w:rPr>
+          <w:rFonts w:ascii="Arial" w:hAnsi="Arial" w:cs="Arial" w:eastAsia="Arial"/>
+          <w:b/>
+          <w:color w:val="1F3A5F"/>
+          <w:sz w:val="21"/>
+        </w:rPr>
+        <w:t xml:space="preserve">6.  </w:t>
       </w:r>
       <w:r>
         <w:rPr>
@@ -9329,63 +10351,7 @@
           <w:color w:val="1F3A5F"/>
           <w:sz w:val="26"/>
         </w:rPr>
-        <w:t>12. Updates will not install</w:t>
-      </w:r>
-    </w:p>
-    <w:p>
-      <w:pPr>
-        <w:pStyle w:val="ListBullet"/>
-        <w:spacing w:after="60"/>
-      </w:pPr>
-      <w:r>
-        <w:rPr>
-          <w:rFonts w:ascii="Arial" w:hAnsi="Arial" w:cs="Arial" w:eastAsia="Arial"/>
-          <w:color w:val="000000"/>
-          <w:sz w:val="21"/>
-        </w:rPr>
-        <w:t>Updates need internet once. Connect, open Settings, and click Install when the prompt appears.</w:t>
-      </w:r>
-    </w:p>
-    <w:p>
-      <w:pPr>
-        <w:pStyle w:val="ListBullet"/>
-        <w:spacing w:after="60"/>
-      </w:pPr>
-      <w:r>
-        <w:rPr>
-          <w:rFonts w:ascii="Arial" w:hAnsi="Arial" w:cs="Arial" w:eastAsia="Arial"/>
-          <w:color w:val="000000"/>
-          <w:sz w:val="21"/>
-        </w:rPr>
-        <w:t>If an install is interrupted, run the app again; it finishes the update before opening.</w:t>
-      </w:r>
-    </w:p>
-    <w:p>
-      <w:pPr>
-        <w:pStyle w:val="ListBullet"/>
-        <w:spacing w:after="60"/>
-      </w:pPr>
-      <w:r>
-        <w:rPr>
-          <w:rFonts w:ascii="Arial" w:hAnsi="Arial" w:cs="Arial" w:eastAsia="Arial"/>
-          <w:color w:val="000000"/>
-          <w:sz w:val="21"/>
-        </w:rPr>
-        <w:t>Compare the version number in Settings with the office's newest computer to know if you are behind.</w:t>
-      </w:r>
-    </w:p>
-    <w:p>
-      <w:pPr>
-        <w:spacing w:after="80" w:before="200"/>
-      </w:pPr>
-      <w:r>
-        <w:rPr>
-          <w:rFonts w:ascii="Arial" w:hAnsi="Arial" w:cs="Arial" w:eastAsia="Arial"/>
-          <w:b/>
-          <w:color w:val="1F3A5F"/>
-          <w:sz w:val="26"/>
-        </w:rPr>
-        <w:t>13. An operator is under the wrong TODA line</w:t>
+        <w:t>12. I saved a wrong edit (or undid one and want the fix back)</w:t>
       </w:r>
     </w:p>
     <w:p>
@@ -9408,7 +10374,7 @@
           <w:color w:val="000000"/>
           <w:sz w:val="21"/>
         </w:rPr>
-        <w:t>Open the record with the pencil icon and check the route field.</w:t>
+        <w:t>Click the clock (History) icon on the record's row.</w:t>
       </w:r>
     </w:p>
     <w:p>
@@ -9431,7 +10397,7 @@
           <w:color w:val="000000"/>
           <w:sz w:val="21"/>
         </w:rPr>
-        <w:t>One operator in the wrong line: edit the record's route directly.</w:t>
+        <w:t>Find the entry that carries the values you want back: every entry with an amber Undo this edit button can put the record back to how it was just before that entry.</w:t>
       </w:r>
     </w:p>
     <w:p>
@@ -9454,104 +10420,7 @@
           <w:color w:val="000000"/>
           <w:sz w:val="21"/>
         </w:rPr>
-        <w:t>A whole line needs re-arranging: that is a rename or route move, which follows the two-key rule.</w:t>
-      </w:r>
-    </w:p>
-    <w:p>
-      <w:pPr>
-        <w:spacing w:after="80" w:before="200"/>
-      </w:pPr>
-      <w:r>
-        <w:rPr>
-          <w:rFonts w:ascii="Arial" w:hAnsi="Arial" w:cs="Arial" w:eastAsia="Arial"/>
-          <w:b/>
-          <w:color w:val="1F3A5F"/>
-          <w:sz w:val="26"/>
-        </w:rPr>
-        <w:t>14. A database was restored and something looks wrong</w:t>
-      </w:r>
-    </w:p>
-    <w:p>
-      <w:pPr>
-        <w:spacing w:after="80"/>
-        <w:ind w:left="340"/>
-      </w:pPr>
-      <w:r>
-        <w:rPr>
-          <w:rFonts w:ascii="Arial" w:hAnsi="Arial" w:cs="Arial" w:eastAsia="Arial"/>
-          <w:b/>
-          <w:color w:val="1F3A5F"/>
-          <w:sz w:val="21"/>
-        </w:rPr>
-        <w:t xml:space="preserve">1.  </w:t>
-      </w:r>
-      <w:r>
-        <w:rPr>
-          <w:rFonts w:ascii="Arial" w:hAnsi="Arial" w:cs="Arial" w:eastAsia="Arial"/>
-          <w:color w:val="000000"/>
-          <w:sz w:val="21"/>
-        </w:rPr>
-        <w:t>Do not panic: the previous database copy is always kept before a restore.</w:t>
-      </w:r>
-    </w:p>
-    <w:p>
-      <w:pPr>
-        <w:spacing w:after="80"/>
-        <w:ind w:left="340"/>
-      </w:pPr>
-      <w:r>
-        <w:rPr>
-          <w:rFonts w:ascii="Arial" w:hAnsi="Arial" w:cs="Arial" w:eastAsia="Arial"/>
-          <w:b/>
-          <w:color w:val="1F3A5F"/>
-          <w:sz w:val="21"/>
-        </w:rPr>
-        <w:t xml:space="preserve">2.  </w:t>
-      </w:r>
-      <w:r>
-        <w:rPr>
-          <w:rFonts w:ascii="Arial" w:hAnsi="Arial" w:cs="Arial" w:eastAsia="Arial"/>
-          <w:color w:val="000000"/>
-          <w:sz w:val="21"/>
-        </w:rPr>
-        <w:t>Compare dashboard totals with the Activity History exports you expect.</w:t>
-      </w:r>
-    </w:p>
-    <w:p>
-      <w:pPr>
-        <w:spacing w:after="80"/>
-        <w:ind w:left="340"/>
-      </w:pPr>
-      <w:r>
-        <w:rPr>
-          <w:rFonts w:ascii="Arial" w:hAnsi="Arial" w:cs="Arial" w:eastAsia="Arial"/>
-          <w:b/>
-          <w:color w:val="1F3A5F"/>
-          <w:sz w:val="21"/>
-        </w:rPr>
-        <w:t xml:space="preserve">3.  </w:t>
-      </w:r>
-      <w:r>
-        <w:rPr>
-          <w:rFonts w:ascii="Arial" w:hAnsi="Arial" w:cs="Arial" w:eastAsia="Arial"/>
-          <w:color w:val="000000"/>
-          <w:sz w:val="21"/>
-        </w:rPr>
-        <w:t>Admin: restore an earlier backup file if numbers are wrong; each restore keeps a rollback copy.</w:t>
-      </w:r>
-    </w:p>
-    <w:p>
-      <w:pPr>
-        <w:spacing w:after="80" w:before="200"/>
-      </w:pPr>
-      <w:r>
-        <w:rPr>
-          <w:rFonts w:ascii="Arial" w:hAnsi="Arial" w:cs="Arial" w:eastAsia="Arial"/>
-          <w:b/>
-          <w:color w:val="1F3A5F"/>
-          <w:sz w:val="26"/>
-        </w:rPr>
-        <w:t>15. My account says it has been deactivated</w:t>
+        <w:t>Click Undo this edit. The record returns to those values immediately, even if many edits came after.</w:t>
       </w:r>
     </w:p>
     <w:p>
@@ -9566,7 +10435,77 @@
           <w:color w:val="000000"/>
           <w:sz w:val="21"/>
         </w:rPr>
-        <w:t>The admin switched the account off. Only an admin can switch it back on:</w:t>
+        <w:t>If the message says the old SBN is now used by another record, nothing was changed. Ask the admin to find the other record (search the old SBN) and move or free it first, then undo again.</w:t>
+      </w:r>
+    </w:p>
+    <w:p>
+      <w:pPr>
+        <w:spacing w:after="80" w:before="200"/>
+      </w:pPr>
+      <w:r>
+        <w:rPr>
+          <w:rFonts w:ascii="Arial" w:hAnsi="Arial" w:cs="Arial" w:eastAsia="Arial"/>
+          <w:b/>
+          <w:color w:val="1F3A5F"/>
+          <w:sz w:val="26"/>
+        </w:rPr>
+        <w:t>13. Updates will not install</w:t>
+      </w:r>
+    </w:p>
+    <w:p>
+      <w:pPr>
+        <w:pStyle w:val="ListBullet"/>
+        <w:spacing w:after="60"/>
+      </w:pPr>
+      <w:r>
+        <w:rPr>
+          <w:rFonts w:ascii="Arial" w:hAnsi="Arial" w:cs="Arial" w:eastAsia="Arial"/>
+          <w:color w:val="000000"/>
+          <w:sz w:val="21"/>
+        </w:rPr>
+        <w:t>Updates need internet once. Connect, open Settings, and click Install when the prompt appears.</w:t>
+      </w:r>
+    </w:p>
+    <w:p>
+      <w:pPr>
+        <w:pStyle w:val="ListBullet"/>
+        <w:spacing w:after="60"/>
+      </w:pPr>
+      <w:r>
+        <w:rPr>
+          <w:rFonts w:ascii="Arial" w:hAnsi="Arial" w:cs="Arial" w:eastAsia="Arial"/>
+          <w:color w:val="000000"/>
+          <w:sz w:val="21"/>
+        </w:rPr>
+        <w:t>If an install is interrupted, run the app again; it finishes the update before opening.</w:t>
+      </w:r>
+    </w:p>
+    <w:p>
+      <w:pPr>
+        <w:pStyle w:val="ListBullet"/>
+        <w:spacing w:after="60"/>
+      </w:pPr>
+      <w:r>
+        <w:rPr>
+          <w:rFonts w:ascii="Arial" w:hAnsi="Arial" w:cs="Arial" w:eastAsia="Arial"/>
+          <w:color w:val="000000"/>
+          <w:sz w:val="21"/>
+        </w:rPr>
+        <w:t>Compare the version number in Settings with the office's newest computer to know if you are behind.</w:t>
+      </w:r>
+    </w:p>
+    <w:p>
+      <w:pPr>
+        <w:spacing w:after="80" w:before="200"/>
+      </w:pPr>
+      <w:r>
+        <w:rPr>
+          <w:rFonts w:ascii="Arial" w:hAnsi="Arial" w:cs="Arial" w:eastAsia="Arial"/>
+          <w:b/>
+          <w:color w:val="1F3A5F"/>
+          <w:sz w:val="26"/>
+        </w:rPr>
+        <w:t>13. An operator is under the wrong TODA line</w:t>
       </w:r>
     </w:p>
     <w:p>
@@ -9589,7 +10528,7 @@
           <w:color w:val="000000"/>
           <w:sz w:val="21"/>
         </w:rPr>
-        <w:t>Ask the admin to sign in on any office computer.</w:t>
+        <w:t>Open the record with the pencil icon and check the route field.</w:t>
       </w:r>
     </w:p>
     <w:p>
@@ -9612,7 +10551,7 @@
           <w:color w:val="000000"/>
           <w:sz w:val="21"/>
         </w:rPr>
-        <w:t>Admin: open Settings &gt; Security, find the account in the table, and click Reactivate. The Admin Console's account table has the same button.</w:t>
+        <w:t>One operator in the wrong line: edit the record's route directly.</w:t>
       </w:r>
     </w:p>
     <w:p>
@@ -9635,7 +10574,104 @@
           <w:color w:val="000000"/>
           <w:sz w:val="21"/>
         </w:rPr>
-        <w:t>Sign in again with the same password as before. Nothing was deleted.</w:t>
+        <w:t>A whole line needs re-arranging: that is a rename or route move, which follows the two-key rule.</w:t>
+      </w:r>
+    </w:p>
+    <w:p>
+      <w:pPr>
+        <w:spacing w:after="80" w:before="200"/>
+      </w:pPr>
+      <w:r>
+        <w:rPr>
+          <w:rFonts w:ascii="Arial" w:hAnsi="Arial" w:cs="Arial" w:eastAsia="Arial"/>
+          <w:b/>
+          <w:color w:val="1F3A5F"/>
+          <w:sz w:val="26"/>
+        </w:rPr>
+        <w:t>14. A database was restored and something looks wrong</w:t>
+      </w:r>
+    </w:p>
+    <w:p>
+      <w:pPr>
+        <w:spacing w:after="80"/>
+        <w:ind w:left="340"/>
+      </w:pPr>
+      <w:r>
+        <w:rPr>
+          <w:rFonts w:ascii="Arial" w:hAnsi="Arial" w:cs="Arial" w:eastAsia="Arial"/>
+          <w:b/>
+          <w:color w:val="1F3A5F"/>
+          <w:sz w:val="21"/>
+        </w:rPr>
+        <w:t xml:space="preserve">1.  </w:t>
+      </w:r>
+      <w:r>
+        <w:rPr>
+          <w:rFonts w:ascii="Arial" w:hAnsi="Arial" w:cs="Arial" w:eastAsia="Arial"/>
+          <w:color w:val="000000"/>
+          <w:sz w:val="21"/>
+        </w:rPr>
+        <w:t>Do not panic: the previous database copy is always kept before a restore.</w:t>
+      </w:r>
+    </w:p>
+    <w:p>
+      <w:pPr>
+        <w:spacing w:after="80"/>
+        <w:ind w:left="340"/>
+      </w:pPr>
+      <w:r>
+        <w:rPr>
+          <w:rFonts w:ascii="Arial" w:hAnsi="Arial" w:cs="Arial" w:eastAsia="Arial"/>
+          <w:b/>
+          <w:color w:val="1F3A5F"/>
+          <w:sz w:val="21"/>
+        </w:rPr>
+        <w:t xml:space="preserve">2.  </w:t>
+      </w:r>
+      <w:r>
+        <w:rPr>
+          <w:rFonts w:ascii="Arial" w:hAnsi="Arial" w:cs="Arial" w:eastAsia="Arial"/>
+          <w:color w:val="000000"/>
+          <w:sz w:val="21"/>
+        </w:rPr>
+        <w:t>Compare dashboard totals with the Activity History exports you expect.</w:t>
+      </w:r>
+    </w:p>
+    <w:p>
+      <w:pPr>
+        <w:spacing w:after="80"/>
+        <w:ind w:left="340"/>
+      </w:pPr>
+      <w:r>
+        <w:rPr>
+          <w:rFonts w:ascii="Arial" w:hAnsi="Arial" w:cs="Arial" w:eastAsia="Arial"/>
+          <w:b/>
+          <w:color w:val="1F3A5F"/>
+          <w:sz w:val="21"/>
+        </w:rPr>
+        <w:t xml:space="preserve">3.  </w:t>
+      </w:r>
+      <w:r>
+        <w:rPr>
+          <w:rFonts w:ascii="Arial" w:hAnsi="Arial" w:cs="Arial" w:eastAsia="Arial"/>
+          <w:color w:val="000000"/>
+          <w:sz w:val="21"/>
+        </w:rPr>
+        <w:t>Admin: restore an earlier backup file if numbers are wrong; each restore keeps a rollback copy.</w:t>
+      </w:r>
+    </w:p>
+    <w:p>
+      <w:pPr>
+        <w:spacing w:after="80" w:before="200"/>
+      </w:pPr>
+      <w:r>
+        <w:rPr>
+          <w:rFonts w:ascii="Arial" w:hAnsi="Arial" w:cs="Arial" w:eastAsia="Arial"/>
+          <w:b/>
+          <w:color w:val="1F3A5F"/>
+          <w:sz w:val="26"/>
+        </w:rPr>
+        <w:t>15. My account says it has been deactivated</w:t>
       </w:r>
     </w:p>
     <w:p>
@@ -9650,21 +10686,76 @@
           <w:color w:val="000000"/>
           <w:sz w:val="21"/>
         </w:rPr>
-        <w:t>A deactivated account keeps every record, certificate, and Activity History entry under its name. Deactivation spreads to every office computer automatically, so the account is blocked everywhere, not just on one machine.</w:t>
-      </w:r>
-    </w:p>
-    <w:p>
-      <w:pPr>
-        <w:spacing w:after="80" w:before="200"/>
+        <w:t>The admin switched the account off. Only an admin can switch it back on:</w:t>
+      </w:r>
+    </w:p>
+    <w:p>
+      <w:pPr>
+        <w:spacing w:after="80"/>
+        <w:ind w:left="340"/>
       </w:pPr>
       <w:r>
         <w:rPr>
           <w:rFonts w:ascii="Arial" w:hAnsi="Arial" w:cs="Arial" w:eastAsia="Arial"/>
           <w:b/>
           <w:color w:val="1F3A5F"/>
-          <w:sz w:val="26"/>
-        </w:rPr>
-        <w:t>16. My buttons for edit and delete are missing</w:t>
+          <w:sz w:val="21"/>
+        </w:rPr>
+        <w:t xml:space="preserve">1.  </w:t>
+      </w:r>
+      <w:r>
+        <w:rPr>
+          <w:rFonts w:ascii="Arial" w:hAnsi="Arial" w:cs="Arial" w:eastAsia="Arial"/>
+          <w:color w:val="000000"/>
+          <w:sz w:val="21"/>
+        </w:rPr>
+        <w:t>Ask the admin to sign in on any office computer.</w:t>
+      </w:r>
+    </w:p>
+    <w:p>
+      <w:pPr>
+        <w:spacing w:after="80"/>
+        <w:ind w:left="340"/>
+      </w:pPr>
+      <w:r>
+        <w:rPr>
+          <w:rFonts w:ascii="Arial" w:hAnsi="Arial" w:cs="Arial" w:eastAsia="Arial"/>
+          <w:b/>
+          <w:color w:val="1F3A5F"/>
+          <w:sz w:val="21"/>
+        </w:rPr>
+        <w:t xml:space="preserve">2.  </w:t>
+      </w:r>
+      <w:r>
+        <w:rPr>
+          <w:rFonts w:ascii="Arial" w:hAnsi="Arial" w:cs="Arial" w:eastAsia="Arial"/>
+          <w:color w:val="000000"/>
+          <w:sz w:val="21"/>
+        </w:rPr>
+        <w:t>Admin: open Settings &gt; Security, find the account in the table, and click Reactivate. The Admin Console's account table has the same button.</w:t>
+      </w:r>
+    </w:p>
+    <w:p>
+      <w:pPr>
+        <w:spacing w:after="80"/>
+        <w:ind w:left="340"/>
+      </w:pPr>
+      <w:r>
+        <w:rPr>
+          <w:rFonts w:ascii="Arial" w:hAnsi="Arial" w:cs="Arial" w:eastAsia="Arial"/>
+          <w:b/>
+          <w:color w:val="1F3A5F"/>
+          <w:sz w:val="21"/>
+        </w:rPr>
+        <w:t xml:space="preserve">3.  </w:t>
+      </w:r>
+      <w:r>
+        <w:rPr>
+          <w:rFonts w:ascii="Arial" w:hAnsi="Arial" w:cs="Arial" w:eastAsia="Arial"/>
+          <w:color w:val="000000"/>
+          <w:sz w:val="21"/>
+        </w:rPr>
+        <w:t>Sign in again with the same password as before. Nothing was deleted.</w:t>
       </w:r>
     </w:p>
     <w:p>
@@ -9679,7 +10770,7 @@
           <w:color w:val="000000"/>
           <w:sz w:val="21"/>
         </w:rPr>
-        <w:t>That is the Viewer role working correctly. A Viewer account can look at everything but change nothing — it is meant for a second computer where people only read records. If you need to make changes on that computer, ask the admin to give you a Clerk account instead, and sign in with it.</w:t>
+        <w:t>A deactivated account keeps every record, certificate, and Activity History entry under its name. Deactivation spreads to every office computer automatically, so the account is blocked everywhere, not just on one machine.</w:t>
       </w:r>
     </w:p>
     <w:p>
@@ -9693,99 +10784,7 @@
           <w:color w:val="1F3A5F"/>
           <w:sz w:val="26"/>
         </w:rPr>
-        <w:t>17. I need to import records but the Franchise folder is gone</w:t>
-      </w:r>
-    </w:p>
-    <w:p>
-      <w:pPr>
-        <w:spacing w:after="80"/>
-        <w:ind w:left="340"/>
-      </w:pPr>
-      <w:r>
-        <w:rPr>
-          <w:rFonts w:ascii="Arial" w:hAnsi="Arial" w:cs="Arial" w:eastAsia="Arial"/>
-          <w:b/>
-          <w:color w:val="1F3A5F"/>
-          <w:sz w:val="21"/>
-        </w:rPr>
-        <w:t xml:space="preserve">1.  </w:t>
-      </w:r>
-      <w:r>
-        <w:rPr>
-          <w:rFonts w:ascii="Arial" w:hAnsi="Arial" w:cs="Arial" w:eastAsia="Arial"/>
-          <w:color w:val="000000"/>
-          <w:sz w:val="21"/>
-        </w:rPr>
-        <w:t>Open Import Records in the sidebar.</w:t>
-      </w:r>
-    </w:p>
-    <w:p>
-      <w:pPr>
-        <w:spacing w:after="80"/>
-        <w:ind w:left="340"/>
-      </w:pPr>
-      <w:r>
-        <w:rPr>
-          <w:rFonts w:ascii="Arial" w:hAnsi="Arial" w:cs="Arial" w:eastAsia="Arial"/>
-          <w:b/>
-          <w:color w:val="1F3A5F"/>
-          <w:sz w:val="21"/>
-        </w:rPr>
-        <w:t xml:space="preserve">2.  </w:t>
-      </w:r>
-      <w:r>
-        <w:rPr>
-          <w:rFonts w:ascii="Arial" w:hAnsi="Arial" w:cs="Arial" w:eastAsia="Arial"/>
-          <w:color w:val="000000"/>
-          <w:sz w:val="21"/>
-        </w:rPr>
-        <w:t>Choose the nightly backup ZIP file (PASADA_Backup_YYYY-MM-DD.zip). PASADA finds the .db inside automatically.</w:t>
-      </w:r>
-    </w:p>
-    <w:p>
-      <w:pPr>
-        <w:spacing w:after="80"/>
-        <w:ind w:left="340"/>
-      </w:pPr>
-      <w:r>
-        <w:rPr>
-          <w:rFonts w:ascii="Arial" w:hAnsi="Arial" w:cs="Arial" w:eastAsia="Arial"/>
-          <w:b/>
-          <w:color w:val="1F3A5F"/>
-          <w:sz w:val="21"/>
-        </w:rPr>
-        <w:t xml:space="preserve">3.  </w:t>
-      </w:r>
-      <w:r>
-        <w:rPr>
-          <w:rFonts w:ascii="Arial" w:hAnsi="Arial" w:cs="Arial" w:eastAsia="Arial"/>
-          <w:color w:val="000000"/>
-          <w:sz w:val="21"/>
-        </w:rPr>
-        <w:t>Leave Merge selected and click Import. Every record the current registry is missing is added; nothing already there is touched.</w:t>
-      </w:r>
-    </w:p>
-    <w:p>
-      <w:pPr>
-        <w:spacing w:after="80"/>
-        <w:ind w:left="340"/>
-      </w:pPr>
-      <w:r>
-        <w:rPr>
-          <w:rFonts w:ascii="Arial" w:hAnsi="Arial" w:cs="Arial" w:eastAsia="Arial"/>
-          <w:b/>
-          <w:color w:val="1F3A5F"/>
-          <w:sz w:val="21"/>
-        </w:rPr>
-        <w:t xml:space="preserve">4.  </w:t>
-      </w:r>
-      <w:r>
-        <w:rPr>
-          <w:rFonts w:ascii="Arial" w:hAnsi="Arial" w:cs="Arial" w:eastAsia="Arial"/>
-          <w:color w:val="000000"/>
-          <w:sz w:val="21"/>
-        </w:rPr>
-        <w:t>Check the totals on the Dashboard against what the office expects, and against a print of the old Excel masterlist if there is one.</w:t>
+        <w:t>16. My buttons for edit and delete are missing</w:t>
       </w:r>
     </w:p>
     <w:p>
@@ -9800,7 +10799,184 @@
           <w:color w:val="000000"/>
           <w:sz w:val="21"/>
         </w:rPr>
+        <w:t>That is the Viewer role working correctly. A Viewer account can look at everything but change nothing — it is meant for a second computer where people only read records. If you need to make changes on that computer, ask the admin to give you a Clerk account instead, and sign in with it.</w:t>
+      </w:r>
+    </w:p>
+    <w:p>
+      <w:pPr>
+        <w:spacing w:after="80" w:before="200"/>
+      </w:pPr>
+      <w:r>
+        <w:rPr>
+          <w:rFonts w:ascii="Arial" w:hAnsi="Arial" w:cs="Arial" w:eastAsia="Arial"/>
+          <w:b/>
+          <w:color w:val="1F3A5F"/>
+          <w:sz w:val="26"/>
+        </w:rPr>
+        <w:t>17. I need to import records but the Franchise folder is gone</w:t>
+      </w:r>
+    </w:p>
+    <w:p>
+      <w:pPr>
+        <w:spacing w:after="80"/>
+        <w:ind w:left="340"/>
+      </w:pPr>
+      <w:r>
+        <w:rPr>
+          <w:rFonts w:ascii="Arial" w:hAnsi="Arial" w:cs="Arial" w:eastAsia="Arial"/>
+          <w:b/>
+          <w:color w:val="1F3A5F"/>
+          <w:sz w:val="21"/>
+        </w:rPr>
+        <w:t xml:space="preserve">1.  </w:t>
+      </w:r>
+      <w:r>
+        <w:rPr>
+          <w:rFonts w:ascii="Arial" w:hAnsi="Arial" w:cs="Arial" w:eastAsia="Arial"/>
+          <w:color w:val="000000"/>
+          <w:sz w:val="21"/>
+        </w:rPr>
+        <w:t>Open Import Records in the sidebar.</w:t>
+      </w:r>
+    </w:p>
+    <w:p>
+      <w:pPr>
+        <w:spacing w:after="80"/>
+        <w:ind w:left="340"/>
+      </w:pPr>
+      <w:r>
+        <w:rPr>
+          <w:rFonts w:ascii="Arial" w:hAnsi="Arial" w:cs="Arial" w:eastAsia="Arial"/>
+          <w:b/>
+          <w:color w:val="1F3A5F"/>
+          <w:sz w:val="21"/>
+        </w:rPr>
+        <w:t xml:space="preserve">2.  </w:t>
+      </w:r>
+      <w:r>
+        <w:rPr>
+          <w:rFonts w:ascii="Arial" w:hAnsi="Arial" w:cs="Arial" w:eastAsia="Arial"/>
+          <w:color w:val="000000"/>
+          <w:sz w:val="21"/>
+        </w:rPr>
+        <w:t>Choose the nightly backup ZIP file (PASADA_Backup_YYYY-MM-DD.zip). PASADA finds the .db inside automatically.</w:t>
+      </w:r>
+    </w:p>
+    <w:p>
+      <w:pPr>
+        <w:spacing w:after="80"/>
+        <w:ind w:left="340"/>
+      </w:pPr>
+      <w:r>
+        <w:rPr>
+          <w:rFonts w:ascii="Arial" w:hAnsi="Arial" w:cs="Arial" w:eastAsia="Arial"/>
+          <w:b/>
+          <w:color w:val="1F3A5F"/>
+          <w:sz w:val="21"/>
+        </w:rPr>
+        <w:t xml:space="preserve">3.  </w:t>
+      </w:r>
+      <w:r>
+        <w:rPr>
+          <w:rFonts w:ascii="Arial" w:hAnsi="Arial" w:cs="Arial" w:eastAsia="Arial"/>
+          <w:color w:val="000000"/>
+          <w:sz w:val="21"/>
+        </w:rPr>
+        <w:t>Leave Merge selected and click Import. Every record the current registry is missing is added; nothing already there is touched.</w:t>
+      </w:r>
+    </w:p>
+    <w:p>
+      <w:pPr>
+        <w:spacing w:after="80"/>
+        <w:ind w:left="340"/>
+      </w:pPr>
+      <w:r>
+        <w:rPr>
+          <w:rFonts w:ascii="Arial" w:hAnsi="Arial" w:cs="Arial" w:eastAsia="Arial"/>
+          <w:b/>
+          <w:color w:val="1F3A5F"/>
+          <w:sz w:val="21"/>
+        </w:rPr>
+        <w:t xml:space="preserve">4.  </w:t>
+      </w:r>
+      <w:r>
+        <w:rPr>
+          <w:rFonts w:ascii="Arial" w:hAnsi="Arial" w:cs="Arial" w:eastAsia="Arial"/>
+          <w:color w:val="000000"/>
+          <w:sz w:val="21"/>
+        </w:rPr>
+        <w:t>Check the totals on the Dashboard against what the office expects, and against a print of the old Excel masterlist if there is one.</w:t>
+      </w:r>
+    </w:p>
+    <w:p>
+      <w:pPr>
+        <w:spacing w:after="120" w:before="0"/>
+      </w:pPr>
+      <w:r>
+        <w:rPr>
+          <w:rFonts w:ascii="Arial" w:hAnsi="Arial" w:cs="Arial" w:eastAsia="Arial"/>
+          <w:b w:val="0"/>
+          <w:i w:val="0"/>
+          <w:color w:val="000000"/>
+          <w:sz w:val="21"/>
+        </w:rPr>
         <w:t>A plain .db file works the same way. Both are admin-only imports; a clerk attempting one sees an access message instead.</w:t>
+      </w:r>
+    </w:p>
+    <w:p>
+      <w:pPr>
+        <w:spacing w:after="80" w:before="200"/>
+      </w:pPr>
+      <w:r>
+        <w:rPr>
+          <w:rFonts w:ascii="Arial" w:hAnsi="Arial" w:cs="Arial" w:eastAsia="Arial"/>
+          <w:b/>
+          <w:color w:val="1F3A5F"/>
+          <w:sz w:val="26"/>
+        </w:rPr>
+        <w:t>19. I changed someone's role and it did not take effect</w:t>
+      </w:r>
+    </w:p>
+    <w:p>
+      <w:pPr>
+        <w:pStyle w:val="ListBullet"/>
+        <w:spacing w:after="60"/>
+      </w:pPr>
+      <w:r>
+        <w:rPr>
+          <w:rFonts w:ascii="Arial" w:hAnsi="Arial" w:cs="Arial" w:eastAsia="Arial"/>
+          <w:color w:val="000000"/>
+          <w:sz w:val="21"/>
+        </w:rPr>
+        <w:t>Refreshing the list fixes a dropdown that jumped back after being rejected (for example, changing the role of your own row, which is disabled on purpose).</w:t>
+      </w:r>
+    </w:p>
+    <w:p>
+      <w:pPr>
+        <w:pStyle w:val="ListBullet"/>
+        <w:spacing w:after="60"/>
+      </w:pPr>
+      <w:r>
+        <w:rPr>
+          <w:rFonts w:ascii="Arial" w:hAnsi="Arial" w:cs="Arial" w:eastAsia="Arial"/>
+          <w:color w:val="000000"/>
+          <w:sz w:val="21"/>
+        </w:rPr>
+        <w:t>A demotion that would remove the office's last active Admin is refused; promote or create another Admin first, then demote.</w:t>
+      </w:r>
+    </w:p>
+    <w:p>
+      <w:pPr>
+        <w:pStyle w:val="ListBullet"/>
+        <w:spacing w:after="60"/>
+      </w:pPr>
+      <w:r>
+        <w:rPr>
+          <w:rFonts w:ascii="Arial" w:hAnsi="Arial" w:cs="Arial" w:eastAsia="Arial"/>
+          <w:color w:val="000000"/>
+          <w:sz w:val="21"/>
+        </w:rPr>
+        <w:t>Role changes reach the other computers within seconds; a computer that is offline applies the change the moment it reconnects.</w:t>
       </w:r>
     </w:p>
     <w:p>
@@ -12357,6 +13533,70 @@
                 <w:sz w:val="20"/>
               </w:rPr>
               <w:t>An account switched off by the admin. It cannot sign in anywhere, but its records and history are kept. Reactivating restores sign-in.</w:t>
+            </w:r>
+          </w:p>
+        </w:tc>
+      </w:tr>
+      <w:tr>
+        <w:tc>
+          <w:tcPr>
+            <w:tcW w:type="dxa" w:w="4677"/>
+          </w:tcPr>
+          <w:p>
+            <w:r>
+              <w:rPr>
+                <w:rFonts w:ascii="Arial" w:hAnsi="Arial" w:cs="Arial" w:eastAsia="Arial"/>
+                <w:color w:val="000000"/>
+                <w:sz w:val="20"/>
+              </w:rPr>
+              <w:t>Role</w:t>
+            </w:r>
+          </w:p>
+        </w:tc>
+        <w:tc>
+          <w:tcPr>
+            <w:tcW w:type="dxa" w:w="4677"/>
+          </w:tcPr>
+          <w:p>
+            <w:r>
+              <w:rPr>
+                <w:rFonts w:ascii="Arial" w:hAnsi="Arial" w:cs="Arial" w:eastAsia="Arial"/>
+                <w:color w:val="000000"/>
+                <w:sz w:val="20"/>
+              </w:rPr>
+              <w:t>What an account may do: Clerk creates and edits records; Admin does everything a clerk can, plus accounts and approvals; Viewer can look and print only.</w:t>
+            </w:r>
+          </w:p>
+        </w:tc>
+      </w:tr>
+      <w:tr>
+        <w:tc>
+          <w:tcPr>
+            <w:tcW w:type="dxa" w:w="4677"/>
+          </w:tcPr>
+          <w:p>
+            <w:r>
+              <w:rPr>
+                <w:rFonts w:ascii="Arial" w:hAnsi="Arial" w:cs="Arial" w:eastAsia="Arial"/>
+                <w:color w:val="000000"/>
+                <w:sz w:val="20"/>
+              </w:rPr>
+              <w:t>Undo an edit</w:t>
+            </w:r>
+          </w:p>
+        </w:tc>
+        <w:tc>
+          <w:tcPr>
+            <w:tcW w:type="dxa" w:w="4677"/>
+          </w:tcPr>
+          <w:p>
+            <w:r>
+              <w:rPr>
+                <w:rFonts w:ascii="Arial" w:hAnsi="Arial" w:cs="Arial" w:eastAsia="Arial"/>
+                <w:color w:val="000000"/>
+                <w:sz w:val="20"/>
+              </w:rPr>
+              <w:t>One click that puts a record back to exactly the values it had before a given edit. Offered right after saving and inside the record's History dialog.</w:t>
             </w:r>
           </w:p>
         </w:tc>

</xml_diff>